<commit_message>
huong dan chay file kt.sh
</commit_message>
<xml_diff>
--- a/cau1.docx
+++ b/cau1.docx
@@ -226,6 +226,105 @@
         </w:drawing>
       </w:r>
     </w:p>
+    <w:p/>
+    <w:p>
+      <w:proofErr w:type="spellStart"/>
+      <w:r>
+        <w:t>Hướng</w:t>
+      </w:r>
+      <w:proofErr w:type="spellEnd"/>
+      <w:r>
+        <w:t xml:space="preserve"> </w:t>
+      </w:r>
+      <w:proofErr w:type="spellStart"/>
+      <w:r>
+        <w:t>dẫn</w:t>
+      </w:r>
+      <w:proofErr w:type="spellEnd"/>
+      <w:r>
+        <w:t xml:space="preserve"> </w:t>
+      </w:r>
+      <w:proofErr w:type="spellStart"/>
+      <w:r>
+        <w:t>chạy</w:t>
+      </w:r>
+      <w:proofErr w:type="spellEnd"/>
+      <w:r>
+        <w:t xml:space="preserve"> file kt.sh:</w:t>
+      </w:r>
+    </w:p>
+    <w:p>
+      <w:proofErr w:type="spellStart"/>
+      <w:r>
+        <w:t>Dùng</w:t>
+      </w:r>
+      <w:proofErr w:type="spellEnd"/>
+      <w:r>
+        <w:t xml:space="preserve"> </w:t>
+      </w:r>
+      <w:proofErr w:type="spellStart"/>
+      <w:r>
+        <w:t>cú</w:t>
+      </w:r>
+      <w:proofErr w:type="spellEnd"/>
+      <w:r>
+        <w:t xml:space="preserve"> </w:t>
+      </w:r>
+      <w:proofErr w:type="spellStart"/>
+      <w:proofErr w:type="gramStart"/>
+      <w:r>
+        <w:t>pháp</w:t>
+      </w:r>
+      <w:proofErr w:type="spellEnd"/>
+      <w:r>
+        <w:t xml:space="preserve"> :</w:t>
+      </w:r>
+      <w:proofErr w:type="gramEnd"/>
+    </w:p>
+    <w:p>
+      <w:r>
+        <w:drawing>
+          <wp:inline distT="0" distB="0" distL="0" distR="0" wp14:anchorId="7EC18834" wp14:editId="619336B0">
+            <wp:extent cx="4553585" cy="1590897"/>
+            <wp:effectExtent l="0" t="0" r="0" b="9525"/>
+            <wp:docPr id="1770443256" name="Picture 1" descr="A computer code on a black background&#10;&#10;Description automatically generated"/>
+            <wp:cNvGraphicFramePr>
+              <a:graphicFrameLocks xmlns:a="http://schemas.openxmlformats.org/drawingml/2006/main" noChangeAspect="1"/>
+            </wp:cNvGraphicFramePr>
+            <a:graphic xmlns:a="http://schemas.openxmlformats.org/drawingml/2006/main">
+              <a:graphicData uri="http://schemas.openxmlformats.org/drawingml/2006/picture">
+                <pic:pic xmlns:pic="http://schemas.openxmlformats.org/drawingml/2006/picture">
+                  <pic:nvPicPr>
+                    <pic:cNvPr id="1770443256" name="Picture 1" descr="A computer code on a black background&#10;&#10;Description automatically generated"/>
+                    <pic:cNvPicPr/>
+                  </pic:nvPicPr>
+                  <pic:blipFill>
+                    <a:blip r:embed="rId5"/>
+                    <a:stretch>
+                      <a:fillRect/>
+                    </a:stretch>
+                  </pic:blipFill>
+                  <pic:spPr>
+                    <a:xfrm>
+                      <a:off x="0" y="0"/>
+                      <a:ext cx="4553585" cy="1590897"/>
+                    </a:xfrm>
+                    <a:prstGeom prst="rect">
+                      <a:avLst/>
+                    </a:prstGeom>
+                  </pic:spPr>
+                </pic:pic>
+              </a:graphicData>
+            </a:graphic>
+          </wp:inline>
+        </w:drawing>
+      </w:r>
+    </w:p>
+    <w:p/>
+    <w:p/>
+    <w:p/>
+    <w:p/>
+    <w:p/>
     <w:sectPr>
       <w:pgSz w:w="12240" w:h="15840"/>
       <w:pgMar w:top="1440" w:right="1440" w:bottom="1440" w:left="1440" w:header="720" w:footer="720" w:gutter="0"/>

</xml_diff>